<commit_message>
Implement per diem calculation updates
</commit_message>
<xml_diff>
--- a/Opomena pred utuzenje.docx
+++ b/Opomena pred utuzenje.docx
@@ -77,10 +77,10 @@
                                 <w:placeholder>
                                   <w:docPart w:val="DefaultPlaceholder_-1854013440"/>
                                 </w:placeholder>
-                                <w:dataBinding w:prefixMappings="xmlns:ns0='urn:microsoft-dynamics-nav/reports/AccusationReminder/50144/'" w:xpath="/ns0:NavWordReportXmlPart[1]/ns0:DataItem1[1]/ns0:No[1]" w:storeItemID="{457B99F0-4FFA-4FEF-85B8-B5950BE70A3C}"/>
+                                <w:dataBinding w:prefixMappings="xmlns:ns0='urn:microsoft-dynamics-nav/reports/IssuedAccusationReminder/50155/'" w:xpath="/ns0:NavWordReportXmlPart[1]/ns0:DataItem1[1]/ns0:No[1]" w:storeItemID="{457B99F0-4FFA-4FEF-85B8-B5950BE70A3C}"/>
                                 <w:text/>
                                 <w:alias w:val="#Nav: /DataItem1/No"/>
-                                <w:tag w:val="#Nav: AccusationReminder/50144"/>
+                                <w:tag w:val="#Nav: IssuedAccusationReminder/50155"/>
                               </w:sdtPr>
                               <w:sdtContent>
                                 <w:r>
@@ -109,10 +109,10 @@
                                 <w:placeholder>
                                   <w:docPart w:val="DefaultPlaceholder_-1854013440"/>
                                 </w:placeholder>
-                                <w:dataBinding w:prefixMappings="xmlns:ns0='urn:microsoft-dynamics-nav/reports/AccusationReminder/50144/'" w:xpath="/ns0:NavWordReportXmlPart[1]/ns0:DataItem1[1]/ns0:Document_Date[1]" w:storeItemID="{457B99F0-4FFA-4FEF-85B8-B5950BE70A3C}"/>
+                                <w:dataBinding w:prefixMappings="xmlns:ns0='urn:microsoft-dynamics-nav/reports/IssuedAccusationReminder/50155/'" w:xpath="/ns0:NavWordReportXmlPart[1]/ns0:DataItem1[1]/ns0:Document_Date[1]" w:storeItemID="{457B99F0-4FFA-4FEF-85B8-B5950BE70A3C}"/>
                                 <w:text/>
                                 <w:alias w:val="#Nav: /DataItem1/Document_Date"/>
-                                <w:tag w:val="#Nav: AccusationReminder/50144"/>
+                                <w:tag w:val="#Nav: IssuedAccusationReminder/50155"/>
                               </w:sdtPr>
                               <w:sdtContent>
                                 <w:proofErr w:type="spellStart"/>
@@ -184,10 +184,10 @@
                           <w:placeholder>
                             <w:docPart w:val="DefaultPlaceholder_-1854013440"/>
                           </w:placeholder>
-                          <w:dataBinding w:prefixMappings="xmlns:ns0='urn:microsoft-dynamics-nav/reports/AccusationReminder/50144/'" w:xpath="/ns0:NavWordReportXmlPart[1]/ns0:DataItem1[1]/ns0:No[1]" w:storeItemID="{457B99F0-4FFA-4FEF-85B8-B5950BE70A3C}"/>
+                          <w:dataBinding w:prefixMappings="xmlns:ns0='urn:microsoft-dynamics-nav/reports/IssuedAccusationReminder/50155/'" w:xpath="/ns0:NavWordReportXmlPart[1]/ns0:DataItem1[1]/ns0:No[1]" w:storeItemID="{457B99F0-4FFA-4FEF-85B8-B5950BE70A3C}"/>
                           <w:text/>
                           <w:alias w:val="#Nav: /DataItem1/No"/>
-                          <w:tag w:val="#Nav: AccusationReminder/50144"/>
+                          <w:tag w:val="#Nav: IssuedAccusationReminder/50155"/>
                         </w:sdtPr>
                         <w:sdtContent>
                           <w:r>
@@ -216,10 +216,10 @@
                           <w:placeholder>
                             <w:docPart w:val="DefaultPlaceholder_-1854013440"/>
                           </w:placeholder>
-                          <w:dataBinding w:prefixMappings="xmlns:ns0='urn:microsoft-dynamics-nav/reports/AccusationReminder/50144/'" w:xpath="/ns0:NavWordReportXmlPart[1]/ns0:DataItem1[1]/ns0:Document_Date[1]" w:storeItemID="{457B99F0-4FFA-4FEF-85B8-B5950BE70A3C}"/>
+                          <w:dataBinding w:prefixMappings="xmlns:ns0='urn:microsoft-dynamics-nav/reports/IssuedAccusationReminder/50155/'" w:xpath="/ns0:NavWordReportXmlPart[1]/ns0:DataItem1[1]/ns0:Document_Date[1]" w:storeItemID="{457B99F0-4FFA-4FEF-85B8-B5950BE70A3C}"/>
                           <w:text/>
                           <w:alias w:val="#Nav: /DataItem1/Document_Date"/>
-                          <w:tag w:val="#Nav: AccusationReminder/50144"/>
+                          <w:tag w:val="#Nav: IssuedAccusationReminder/50155"/>
                         </w:sdtPr>
                         <w:sdtContent>
                           <w:proofErr w:type="spellStart"/>
@@ -302,10 +302,10 @@
                 <w:placeholder>
                   <w:docPart w:val="DefaultPlaceholder_-1854013440"/>
                 </w:placeholder>
-                <w:dataBinding w:prefixMappings="xmlns:ns0='urn:microsoft-dynamics-nav/reports/AccusationReminder/50144/'" w:xpath="/ns0:NavWordReportXmlPart[1]/ns0:DataItem1[1]/ns0:CustomerName[1]" w:storeItemID="{457B99F0-4FFA-4FEF-85B8-B5950BE70A3C}"/>
+                <w:dataBinding w:prefixMappings="xmlns:ns0='urn:microsoft-dynamics-nav/reports/IssuedAccusationReminder/50155/'" w:xpath="/ns0:NavWordReportXmlPart[1]/ns0:DataItem1[1]/ns0:CustomerName[1]" w:storeItemID="{457B99F0-4FFA-4FEF-85B8-B5950BE70A3C}"/>
                 <w:text/>
                 <w:alias w:val="#Nav: /DataItem1/CustomerName"/>
-                <w:tag w:val="#Nav: AccusationReminder/50144"/>
+                <w:tag w:val="#Nav: IssuedAccusationReminder/50155"/>
               </w:sdtPr>
               <w:sdtContent>
                 <w:proofErr w:type="spellStart"/>
@@ -357,10 +357,10 @@
                 <w:placeholder>
                   <w:docPart w:val="DefaultPlaceholder_-1854013440"/>
                 </w:placeholder>
-                <w:dataBinding w:prefixMappings="xmlns:ns0='urn:microsoft-dynamics-nav/reports/AccusationReminder/50144/'" w:xpath="/ns0:NavWordReportXmlPart[1]/ns0:DataItem1[1]/ns0:CustomerAddress[1]" w:storeItemID="{457B99F0-4FFA-4FEF-85B8-B5950BE70A3C}"/>
+                <w:dataBinding w:prefixMappings="xmlns:ns0='urn:microsoft-dynamics-nav/reports/IssuedAccusationReminder/50155/'" w:xpath="/ns0:NavWordReportXmlPart[1]/ns0:DataItem1[1]/ns0:CustomerAddress[1]" w:storeItemID="{457B99F0-4FFA-4FEF-85B8-B5950BE70A3C}"/>
                 <w:text/>
                 <w:alias w:val="#Nav: /DataItem1/CustomerAddress"/>
-                <w:tag w:val="#Nav: AccusationReminder/50144"/>
+                <w:tag w:val="#Nav: IssuedAccusationReminder/50155"/>
               </w:sdtPr>
               <w:sdtContent>
                 <w:proofErr w:type="spellStart"/>
@@ -404,10 +404,10 @@
                 <w:placeholder>
                   <w:docPart w:val="DefaultPlaceholder_-1854013440"/>
                 </w:placeholder>
-                <w:dataBinding w:prefixMappings="xmlns:ns0='urn:microsoft-dynamics-nav/reports/AccusationReminder/50144/'" w:xpath="/ns0:NavWordReportXmlPart[1]/ns0:DataItem1[1]/ns0:CustomerCity[1]" w:storeItemID="{457B99F0-4FFA-4FEF-85B8-B5950BE70A3C}"/>
+                <w:dataBinding w:prefixMappings="xmlns:ns0='urn:microsoft-dynamics-nav/reports/IssuedAccusationReminder/50155/'" w:xpath="/ns0:NavWordReportXmlPart[1]/ns0:DataItem1[1]/ns0:CustomerCity[1]" w:storeItemID="{457B99F0-4FFA-4FEF-85B8-B5950BE70A3C}"/>
                 <w:text/>
                 <w:alias w:val="#Nav: /DataItem1/CustomerCity"/>
-                <w:tag w:val="#Nav: AccusationReminder/50144"/>
+                <w:tag w:val="#Nav: IssuedAccusationReminder/50155"/>
               </w:sdtPr>
               <w:sdtContent>
                 <w:proofErr w:type="spellStart"/>
@@ -447,10 +447,10 @@
                 <w:placeholder>
                   <w:docPart w:val="DefaultPlaceholder_-1854013440"/>
                 </w:placeholder>
-                <w:dataBinding w:prefixMappings="xmlns:ns0='urn:microsoft-dynamics-nav/reports/AccusationReminder/50144/'" w:xpath="/ns0:NavWordReportXmlPart[1]/ns0:DataItem1[1]/ns0:CompInfoCity[1]" w:storeItemID="{457B99F0-4FFA-4FEF-85B8-B5950BE70A3C}"/>
+                <w:dataBinding w:prefixMappings="xmlns:ns0='urn:microsoft-dynamics-nav/reports/IssuedAccusationReminder/50155/'" w:xpath="/ns0:NavWordReportXmlPart[1]/ns0:DataItem1[1]/ns0:CompInfoCity[1]" w:storeItemID="{457B99F0-4FFA-4FEF-85B8-B5950BE70A3C}"/>
                 <w:text/>
                 <w:alias w:val="#Nav: /DataItem1/CompInfoCity"/>
-                <w:tag w:val="#Nav: AccusationReminder/50144"/>
+                <w:tag w:val="#Nav: IssuedAccusationReminder/50155"/>
               </w:sdtPr>
               <w:sdtContent>
                 <w:proofErr w:type="spellStart"/>
@@ -484,10 +484,10 @@
                 <w:placeholder>
                   <w:docPart w:val="DefaultPlaceholder_-1854013440"/>
                 </w:placeholder>
-                <w:dataBinding w:prefixMappings="xmlns:ns0='urn:microsoft-dynamics-nav/reports/AccusationReminder/50144/'" w:xpath="/ns0:NavWordReportXmlPart[1]/ns0:DataItem1[1]/ns0:CompInfoAddress[1]" w:storeItemID="{457B99F0-4FFA-4FEF-85B8-B5950BE70A3C}"/>
+                <w:dataBinding w:prefixMappings="xmlns:ns0='urn:microsoft-dynamics-nav/reports/IssuedAccusationReminder/50155/'" w:xpath="/ns0:NavWordReportXmlPart[1]/ns0:DataItem1[1]/ns0:CompInfoAddress[1]" w:storeItemID="{457B99F0-4FFA-4FEF-85B8-B5950BE70A3C}"/>
                 <w:text/>
                 <w:alias w:val="#Nav: /DataItem1/CompInfoAddress"/>
-                <w:tag w:val="#Nav: AccusationReminder/50144"/>
+                <w:tag w:val="#Nav: IssuedAccusationReminder/50155"/>
               </w:sdtPr>
               <w:sdtContent>
                 <w:proofErr w:type="spellStart"/>
@@ -514,10 +514,10 @@
               <w:placeholder>
                 <w:docPart w:val="DefaultPlaceholder_-1854013440"/>
               </w:placeholder>
-              <w:dataBinding w:prefixMappings="xmlns:ns0='urn:microsoft-dynamics-nav/reports/AccusationReminder/50144/'" w:xpath="/ns0:NavWordReportXmlPart[1]/ns0:DataItem1[1]/ns0:CompPage[1]" w:storeItemID="{457B99F0-4FFA-4FEF-85B8-B5950BE70A3C}"/>
+              <w:dataBinding w:prefixMappings="xmlns:ns0='urn:microsoft-dynamics-nav/reports/IssuedAccusationReminder/50155/'" w:xpath="/ns0:NavWordReportXmlPart[1]/ns0:DataItem1[1]/ns0:CompPage[1]" w:storeItemID="{457B99F0-4FFA-4FEF-85B8-B5950BE70A3C}"/>
               <w:text/>
               <w:alias w:val="#Nav: /DataItem1/CompPage"/>
-              <w:tag w:val="#Nav: AccusationReminder/50144"/>
+              <w:tag w:val="#Nav: IssuedAccusationReminder/50155"/>
             </w:sdtPr>
             <w:sdtContent>
               <w:p>
@@ -612,10 +612,10 @@
                 <w:placeholder>
                   <w:docPart w:val="DefaultPlaceholder_-1854013440"/>
                 </w:placeholder>
-                <w:dataBinding w:prefixMappings="xmlns:ns0='urn:microsoft-dynamics-nav/reports/AccusationReminder/50144/'" w:xpath="/ns0:NavWordReportXmlPart[1]/ns0:DataItem1[1]/ns0:CEO_Phone[1]" w:storeItemID="{457B99F0-4FFA-4FEF-85B8-B5950BE70A3C}"/>
+                <w:dataBinding w:prefixMappings="xmlns:ns0='urn:microsoft-dynamics-nav/reports/IssuedAccusationReminder/50155/'" w:xpath="/ns0:NavWordReportXmlPart[1]/ns0:DataItem1[1]/ns0:CEO_Phone[1]" w:storeItemID="{457B99F0-4FFA-4FEF-85B8-B5950BE70A3C}"/>
                 <w:text/>
                 <w:alias w:val="#Nav: /DataItem1/CEO_Phone"/>
-                <w:tag w:val="#Nav: AccusationReminder/50144"/>
+                <w:tag w:val="#Nav: IssuedAccusationReminder/50155"/>
               </w:sdtPr>
               <w:sdtContent>
                 <w:proofErr w:type="spellStart"/>
@@ -711,10 +711,10 @@
                 <w:placeholder>
                   <w:docPart w:val="DefaultPlaceholder_-1854013440"/>
                 </w:placeholder>
-                <w:dataBinding w:prefixMappings="xmlns:ns0='urn:microsoft-dynamics-nav/reports/AccusationReminder/50144/'" w:xpath="/ns0:NavWordReportXmlPart[1]/ns0:DataItem1[1]/ns0:PhoneNo[1]" w:storeItemID="{457B99F0-4FFA-4FEF-85B8-B5950BE70A3C}"/>
+                <w:dataBinding w:prefixMappings="xmlns:ns0='urn:microsoft-dynamics-nav/reports/IssuedAccusationReminder/50155/'" w:xpath="/ns0:NavWordReportXmlPart[1]/ns0:DataItem1[1]/ns0:PhoneNo[1]" w:storeItemID="{457B99F0-4FFA-4FEF-85B8-B5950BE70A3C}"/>
                 <w:text/>
                 <w:alias w:val="#Nav: /DataItem1/PhoneNo"/>
-                <w:tag w:val="#Nav: AccusationReminder/50144"/>
+                <w:tag w:val="#Nav: IssuedAccusationReminder/50155"/>
               </w:sdtPr>
               <w:sdtContent>
                 <w:proofErr w:type="spellStart"/>
@@ -822,10 +822,10 @@
                 <w:placeholder>
                   <w:docPart w:val="DefaultPlaceholder_-1854013440"/>
                 </w:placeholder>
-                <w:dataBinding w:prefixMappings="xmlns:ns0='urn:microsoft-dynamics-nav/reports/AccusationReminder/50144/'" w:xpath="/ns0:NavWordReportXmlPart[1]/ns0:DataItem1[1]/ns0:PhoneNo2[1]" w:storeItemID="{457B99F0-4FFA-4FEF-85B8-B5950BE70A3C}"/>
+                <w:dataBinding w:prefixMappings="xmlns:ns0='urn:microsoft-dynamics-nav/reports/IssuedAccusationReminder/50155/'" w:xpath="/ns0:NavWordReportXmlPart[1]/ns0:DataItem1[1]/ns0:PhoneNo2[1]" w:storeItemID="{457B99F0-4FFA-4FEF-85B8-B5950BE70A3C}"/>
                 <w:text/>
                 <w:alias w:val="#Nav: /DataItem1/PhoneNo2"/>
-                <w:tag w:val="#Nav: AccusationReminder/50144"/>
+                <w:tag w:val="#Nav: IssuedAccusationReminder/50155"/>
               </w:sdtPr>
               <w:sdtContent>
                 <w:r>
@@ -883,10 +883,10 @@
                 <w:placeholder>
                   <w:docPart w:val="DefaultPlaceholder_-1854013440"/>
                 </w:placeholder>
-                <w:dataBinding w:prefixMappings="xmlns:ns0='urn:microsoft-dynamics-nav/reports/AccusationReminder/50144/'" w:xpath="/ns0:NavWordReportXmlPart[1]/ns0:DataItem1[1]/ns0:FaxNo[1]" w:storeItemID="{457B99F0-4FFA-4FEF-85B8-B5950BE70A3C}"/>
+                <w:dataBinding w:prefixMappings="xmlns:ns0='urn:microsoft-dynamics-nav/reports/IssuedAccusationReminder/50155/'" w:xpath="/ns0:NavWordReportXmlPart[1]/ns0:DataItem1[1]/ns0:FaxNo[1]" w:storeItemID="{457B99F0-4FFA-4FEF-85B8-B5950BE70A3C}"/>
                 <w:text/>
                 <w:alias w:val="#Nav: /DataItem1/FaxNo"/>
-                <w:tag w:val="#Nav: AccusationReminder/50144"/>
+                <w:tag w:val="#Nav: IssuedAccusationReminder/50155"/>
               </w:sdtPr>
               <w:sdtContent>
                 <w:proofErr w:type="spellStart"/>
@@ -1066,10 +1066,10 @@
           <w:placeholder>
             <w:docPart w:val="DefaultPlaceholder_-1854013440"/>
           </w:placeholder>
-          <w:dataBinding w:prefixMappings="xmlns:ns0='urn:microsoft-dynamics-nav/reports/AccusationReminder/50144/'" w:xpath="/ns0:NavWordReportXmlPart[1]/ns0:DataItem1[1]/ns0:Debt[1]" w:storeItemID="{457B99F0-4FFA-4FEF-85B8-B5950BE70A3C}"/>
+          <w:dataBinding w:prefixMappings="xmlns:ns0='urn:microsoft-dynamics-nav/reports/IssuedAccusationReminder/50155/'" w:xpath="/ns0:NavWordReportXmlPart[1]/ns0:DataItem1[1]/ns0:Debt[1]" w:storeItemID="{457B99F0-4FFA-4FEF-85B8-B5950BE70A3C}"/>
           <w:text/>
           <w:alias w:val="#Nav: /DataItem1/Debt"/>
-          <w:tag w:val="#Nav: AccusationReminder/50144"/>
+          <w:tag w:val="#Nav: IssuedAccusationReminder/50155"/>
         </w:sdtPr>
         <w:sdtContent>
           <w:r>
@@ -1166,10 +1166,10 @@
           <w:placeholder>
             <w:docPart w:val="DefaultPlaceholder_-1854013440"/>
           </w:placeholder>
-          <w:dataBinding w:prefixMappings="xmlns:ns0='urn:microsoft-dynamics-nav/reports/AccusationReminder/50144/'" w:xpath="/ns0:NavWordReportXmlPart[1]/ns0:DataItem1[1]/ns0:DeadlineDate[1]" w:storeItemID="{457B99F0-4FFA-4FEF-85B8-B5950BE70A3C}"/>
+          <w:dataBinding w:prefixMappings="xmlns:ns0='urn:microsoft-dynamics-nav/reports/IssuedAccusationReminder/50155/'" w:xpath="/ns0:NavWordReportXmlPart[1]/ns0:DataItem1[1]/ns0:DeadlineDate[1]" w:storeItemID="{457B99F0-4FFA-4FEF-85B8-B5950BE70A3C}"/>
           <w:text/>
           <w:alias w:val="#Nav: /DataItem1/DeadlineDate"/>
-          <w:tag w:val="#Nav: AccusationReminder/50144"/>
+          <w:tag w:val="#Nav: IssuedAccusationReminder/50155"/>
         </w:sdtPr>
         <w:sdtContent>
           <w:proofErr w:type="spellStart"/>
@@ -1581,10 +1581,10 @@
           <w:placeholder>
             <w:docPart w:val="DefaultPlaceholder_-1854013440"/>
           </w:placeholder>
-          <w:dataBinding w:prefixMappings="xmlns:ns0='urn:microsoft-dynamics-nav/reports/AccusationReminder/50144/'" w:xpath="/ns0:NavWordReportXmlPart[1]/ns0:DataItem1[1]/ns0:AccusationPhone[1]" w:storeItemID="{457B99F0-4FFA-4FEF-85B8-B5950BE70A3C}"/>
+          <w:dataBinding w:prefixMappings="xmlns:ns0='urn:microsoft-dynamics-nav/reports/IssuedAccusationReminder/50155/'" w:xpath="/ns0:NavWordReportXmlPart[1]/ns0:DataItem1[1]/ns0:AccusationPhone[1]" w:storeItemID="{457B99F0-4FFA-4FEF-85B8-B5950BE70A3C}"/>
           <w:text/>
           <w:alias w:val="#Nav: /DataItem1/AccusationPhone"/>
-          <w:tag w:val="#Nav: AccusationReminder/50144"/>
+          <w:tag w:val="#Nav: IssuedAccusationReminder/50155"/>
         </w:sdtPr>
         <w:sdtContent>
           <w:proofErr w:type="spellStart"/>
@@ -1692,10 +1692,10 @@
             <w:placeholder>
               <w:docPart w:val="DefaultPlaceholder_-1854013440"/>
             </w:placeholder>
-            <w:dataBinding w:prefixMappings="xmlns:ns0='urn:microsoft-dynamics-nav/reports/AccusationReminder/50144/'" w:xpath="/ns0:NavWordReportXmlPart[1]/ns0:DataItem1[1]/ns0:RespPosition[1]" w:storeItemID="{457B99F0-4FFA-4FEF-85B8-B5950BE70A3C}"/>
+            <w:dataBinding w:prefixMappings="xmlns:ns0='urn:microsoft-dynamics-nav/reports/IssuedAccusationReminder/50155/'" w:xpath="/ns0:NavWordReportXmlPart[1]/ns0:DataItem1[1]/ns0:RespPosition[1]" w:storeItemID="{457B99F0-4FFA-4FEF-85B8-B5950BE70A3C}"/>
             <w:text/>
             <w:alias w:val="#Nav: /DataItem1/RespPosition"/>
-            <w:tag w:val="#Nav: AccusationReminder/50144"/>
+            <w:tag w:val="#Nav: IssuedAccusationReminder/50155"/>
           </w:sdtPr>
           <w:sdtContent>
             <w:tc>
@@ -1729,10 +1729,10 @@
             <w:placeholder>
               <w:docPart w:val="DefaultPlaceholder_-1854013440"/>
             </w:placeholder>
-            <w:dataBinding w:prefixMappings="xmlns:ns0='urn:microsoft-dynamics-nav/reports/AccusationReminder/50144/'" w:xpath="/ns0:NavWordReportXmlPart[1]/ns0:DataItem1[1]/ns0:RespPerson[1]" w:storeItemID="{457B99F0-4FFA-4FEF-85B8-B5950BE70A3C}"/>
+            <w:dataBinding w:prefixMappings="xmlns:ns0='urn:microsoft-dynamics-nav/reports/IssuedAccusationReminder/50155/'" w:xpath="/ns0:NavWordReportXmlPart[1]/ns0:DataItem1[1]/ns0:RespPerson[1]" w:storeItemID="{457B99F0-4FFA-4FEF-85B8-B5950BE70A3C}"/>
             <w:text/>
             <w:alias w:val="#Nav: /DataItem1/RespPerson"/>
-            <w:tag w:val="#Nav: AccusationReminder/50144"/>
+            <w:tag w:val="#Nav: IssuedAccusationReminder/50155"/>
           </w:sdtPr>
           <w:sdtContent>
             <w:tc>
@@ -1909,10 +1909,10 @@
         <w:placeholder>
           <w:docPart w:val="DefaultPlaceholder_-1854013440"/>
         </w:placeholder>
-        <w:dataBinding w:prefixMappings="xmlns:ns0='urn:microsoft-dynamics-nav/reports/AccusationReminder/50144/'" w:xpath="/ns0:NavWordReportXmlPart[1]/ns0:DataItem1[1]/ns0:transUni[1]" w:storeItemID="{457B99F0-4FFA-4FEF-85B8-B5950BE70A3C}"/>
+        <w:dataBinding w:prefixMappings="xmlns:ns0='urn:microsoft-dynamics-nav/reports/IssuedAccusationReminder/50155/'" w:xpath="/ns0:NavWordReportXmlPart[1]/ns0:DataItem1[1]/ns0:transUni[1]" w:storeItemID="{457B99F0-4FFA-4FEF-85B8-B5950BE70A3C}"/>
         <w:text/>
         <w:alias w:val="#Nav: /DataItem1/transUni"/>
-        <w:tag w:val="#Nav: AccusationReminder/50144"/>
+        <w:tag w:val="#Nav: IssuedAccusationReminder/50155"/>
       </w:sdtPr>
       <w:sdtContent>
         <w:proofErr w:type="spellStart"/>
@@ -1946,10 +1946,10 @@
         <w:placeholder>
           <w:docPart w:val="DefaultPlaceholder_-1854013440"/>
         </w:placeholder>
-        <w:dataBinding w:prefixMappings="xmlns:ns0='urn:microsoft-dynamics-nav/reports/AccusationReminder/50144/'" w:xpath="/ns0:NavWordReportXmlPart[1]/ns0:DataItem1[1]/ns0:transUnion[1]" w:storeItemID="{457B99F0-4FFA-4FEF-85B8-B5950BE70A3C}"/>
+        <w:dataBinding w:prefixMappings="xmlns:ns0='urn:microsoft-dynamics-nav/reports/IssuedAccusationReminder/50155/'" w:xpath="/ns0:NavWordReportXmlPart[1]/ns0:DataItem1[1]/ns0:transUnion[1]" w:storeItemID="{457B99F0-4FFA-4FEF-85B8-B5950BE70A3C}"/>
         <w:text/>
         <w:alias w:val="#Nav: /DataItem1/transUnion"/>
-        <w:tag w:val="#Nav: AccusationReminder/50144"/>
+        <w:tag w:val="#Nav: IssuedAccusationReminder/50155"/>
       </w:sdtPr>
       <w:sdtContent>
         <w:proofErr w:type="spellStart"/>
@@ -2001,10 +2001,10 @@
         <w:placeholder>
           <w:docPart w:val="DefaultPlaceholder_-1854013440"/>
         </w:placeholder>
-        <w:dataBinding w:prefixMappings="xmlns:ns0='urn:microsoft-dynamics-nav/reports/AccusationReminder/50144/'" w:xpath="/ns0:NavWordReportXmlPart[1]/ns0:DataItem1[1]/ns0:transRaif[1]" w:storeItemID="{457B99F0-4FFA-4FEF-85B8-B5950BE70A3C}"/>
+        <w:dataBinding w:prefixMappings="xmlns:ns0='urn:microsoft-dynamics-nav/reports/IssuedAccusationReminder/50155/'" w:xpath="/ns0:NavWordReportXmlPart[1]/ns0:DataItem1[1]/ns0:transRaif[1]" w:storeItemID="{457B99F0-4FFA-4FEF-85B8-B5950BE70A3C}"/>
         <w:text/>
         <w:alias w:val="#Nav: /DataItem1/transRaif"/>
-        <w:tag w:val="#Nav: AccusationReminder/50144"/>
+        <w:tag w:val="#Nav: IssuedAccusationReminder/50155"/>
       </w:sdtPr>
       <w:sdtContent>
         <w:proofErr w:type="spellStart"/>
@@ -2057,10 +2057,10 @@
         <w:placeholder>
           <w:docPart w:val="DefaultPlaceholder_-1854013440"/>
         </w:placeholder>
-        <w:dataBinding w:prefixMappings="xmlns:ns0='urn:microsoft-dynamics-nav/reports/AccusationReminder/50144/'" w:xpath="/ns0:NavWordReportXmlPart[1]/ns0:DataItem1[1]/ns0:transIntesa[1]" w:storeItemID="{457B99F0-4FFA-4FEF-85B8-B5950BE70A3C}"/>
+        <w:dataBinding w:prefixMappings="xmlns:ns0='urn:microsoft-dynamics-nav/reports/IssuedAccusationReminder/50155/'" w:xpath="/ns0:NavWordReportXmlPart[1]/ns0:DataItem1[1]/ns0:transIntesa[1]" w:storeItemID="{457B99F0-4FFA-4FEF-85B8-B5950BE70A3C}"/>
         <w:text/>
         <w:alias w:val="#Nav: /DataItem1/transIntesa"/>
-        <w:tag w:val="#Nav: AccusationReminder/50144"/>
+        <w:tag w:val="#Nav: IssuedAccusationReminder/50155"/>
       </w:sdtPr>
       <w:sdtContent>
         <w:proofErr w:type="spellStart"/>
@@ -2094,10 +2094,10 @@
         <w:placeholder>
           <w:docPart w:val="DefaultPlaceholder_-1854013440"/>
         </w:placeholder>
-        <w:dataBinding w:prefixMappings="xmlns:ns0='urn:microsoft-dynamics-nav/reports/AccusationReminder/50144/'" w:xpath="/ns0:NavWordReportXmlPart[1]/ns0:DataItem1[1]/ns0:transBBI[1]" w:storeItemID="{457B99F0-4FFA-4FEF-85B8-B5950BE70A3C}"/>
+        <w:dataBinding w:prefixMappings="xmlns:ns0='urn:microsoft-dynamics-nav/reports/IssuedAccusationReminder/50155/'" w:xpath="/ns0:NavWordReportXmlPart[1]/ns0:DataItem1[1]/ns0:transBBI[1]" w:storeItemID="{457B99F0-4FFA-4FEF-85B8-B5950BE70A3C}"/>
         <w:text/>
         <w:alias w:val="#Nav: /DataItem1/transBBI"/>
-        <w:tag w:val="#Nav: AccusationReminder/50144"/>
+        <w:tag w:val="#Nav: IssuedAccusationReminder/50155"/>
       </w:sdtPr>
       <w:sdtContent>
         <w:proofErr w:type="spellStart"/>
@@ -2142,10 +2142,10 @@
         <w:placeholder>
           <w:docPart w:val="DefaultPlaceholder_-1854013440"/>
         </w:placeholder>
-        <w:dataBinding w:prefixMappings="xmlns:ns0='urn:microsoft-dynamics-nav/reports/AccusationReminder/50144/'" w:xpath="/ns0:NavWordReportXmlPart[1]/ns0:DataItem1[1]/ns0:court[1]" w:storeItemID="{457B99F0-4FFA-4FEF-85B8-B5950BE70A3C}"/>
+        <w:dataBinding w:prefixMappings="xmlns:ns0='urn:microsoft-dynamics-nav/reports/IssuedAccusationReminder/50155/'" w:xpath="/ns0:NavWordReportXmlPart[1]/ns0:DataItem1[1]/ns0:court[1]" w:storeItemID="{457B99F0-4FFA-4FEF-85B8-B5950BE70A3C}"/>
         <w:text/>
         <w:alias w:val="#Nav: /DataItem1/court"/>
-        <w:tag w:val="#Nav: AccusationReminder/50144"/>
+        <w:tag w:val="#Nav: IssuedAccusationReminder/50155"/>
       </w:sdtPr>
       <w:sdtContent>
         <w:proofErr w:type="spellStart"/>
@@ -2201,10 +2201,10 @@
         <w:placeholder>
           <w:docPart w:val="DefaultPlaceholder_-1854013440"/>
         </w:placeholder>
-        <w:dataBinding w:prefixMappings="xmlns:ns0='urn:microsoft-dynamics-nav/reports/AccusationReminder/50144/'" w:xpath="/ns0:NavWordReportXmlPart[1]/ns0:DataItem1[1]/ns0:registrationNumber[1]" w:storeItemID="{457B99F0-4FFA-4FEF-85B8-B5950BE70A3C}"/>
+        <w:dataBinding w:prefixMappings="xmlns:ns0='urn:microsoft-dynamics-nav/reports/IssuedAccusationReminder/50155/'" w:xpath="/ns0:NavWordReportXmlPart[1]/ns0:DataItem1[1]/ns0:registrationNumber[1]" w:storeItemID="{457B99F0-4FFA-4FEF-85B8-B5950BE70A3C}"/>
         <w:text/>
         <w:alias w:val="#Nav: /DataItem1/registrationNumber"/>
-        <w:tag w:val="#Nav: AccusationReminder/50144"/>
+        <w:tag w:val="#Nav: IssuedAccusationReminder/50155"/>
       </w:sdtPr>
       <w:sdtContent>
         <w:proofErr w:type="spellStart"/>
@@ -2238,10 +2238,10 @@
         <w:placeholder>
           <w:docPart w:val="DefaultPlaceholder_-1854013440"/>
         </w:placeholder>
-        <w:dataBinding w:prefixMappings="xmlns:ns0='urn:microsoft-dynamics-nav/reports/AccusationReminder/50144/'" w:xpath="/ns0:NavWordReportXmlPart[1]/ns0:DataItem1[1]/ns0:registrationVATNumber[1]" w:storeItemID="{457B99F0-4FFA-4FEF-85B8-B5950BE70A3C}"/>
+        <w:dataBinding w:prefixMappings="xmlns:ns0='urn:microsoft-dynamics-nav/reports/IssuedAccusationReminder/50155/'" w:xpath="/ns0:NavWordReportXmlPart[1]/ns0:DataItem1[1]/ns0:registrationVATNumber[1]" w:storeItemID="{457B99F0-4FFA-4FEF-85B8-B5950BE70A3C}"/>
         <w:text/>
         <w:alias w:val="#Nav: /DataItem1/registrationVATNumber"/>
-        <w:tag w:val="#Nav: AccusationReminder/50144"/>
+        <w:tag w:val="#Nav: IssuedAccusationReminder/50155"/>
       </w:sdtPr>
       <w:sdtContent>
         <w:proofErr w:type="spellStart"/>
@@ -2275,10 +2275,10 @@
         <w:placeholder>
           <w:docPart w:val="DefaultPlaceholder_-1854013440"/>
         </w:placeholder>
-        <w:dataBinding w:prefixMappings="xmlns:ns0='urn:microsoft-dynamics-nav/reports/AccusationReminder/50144/'" w:xpath="/ns0:NavWordReportXmlPart[1]/ns0:DataItem1[1]/ns0:vatNumber[1]" w:storeItemID="{457B99F0-4FFA-4FEF-85B8-B5950BE70A3C}"/>
+        <w:dataBinding w:prefixMappings="xmlns:ns0='urn:microsoft-dynamics-nav/reports/IssuedAccusationReminder/50155/'" w:xpath="/ns0:NavWordReportXmlPart[1]/ns0:DataItem1[1]/ns0:vatNumber[1]" w:storeItemID="{457B99F0-4FFA-4FEF-85B8-B5950BE70A3C}"/>
         <w:text/>
         <w:alias w:val="#Nav: /DataItem1/vatNumber"/>
-        <w:tag w:val="#Nav: AccusationReminder/50144"/>
+        <w:tag w:val="#Nav: IssuedAccusationReminder/50155"/>
       </w:sdtPr>
       <w:sdtContent>
         <w:proofErr w:type="spellStart"/>
@@ -2312,10 +2312,10 @@
         <w:placeholder>
           <w:docPart w:val="DefaultPlaceholder_-1854013440"/>
         </w:placeholder>
-        <w:dataBinding w:prefixMappings="xmlns:ns0='urn:microsoft-dynamics-nav/reports/AccusationReminder/50144/'" w:xpath="/ns0:NavWordReportXmlPart[1]/ns0:DataItem1[1]/ns0:activityCode[1]" w:storeItemID="{457B99F0-4FFA-4FEF-85B8-B5950BE70A3C}"/>
+        <w:dataBinding w:prefixMappings="xmlns:ns0='urn:microsoft-dynamics-nav/reports/IssuedAccusationReminder/50155/'" w:xpath="/ns0:NavWordReportXmlPart[1]/ns0:DataItem1[1]/ns0:activityCode[1]" w:storeItemID="{457B99F0-4FFA-4FEF-85B8-B5950BE70A3C}"/>
         <w:text/>
         <w:alias w:val="#Nav: /DataItem1/activityCode"/>
-        <w:tag w:val="#Nav: AccusationReminder/50144"/>
+        <w:tag w:val="#Nav: IssuedAccusationReminder/50155"/>
       </w:sdtPr>
       <w:sdtContent>
         <w:proofErr w:type="spellStart"/>
@@ -2393,10 +2393,10 @@
       <w:sdtPr>
         <w:id w:val="1036085437"/>
         <w:showingPlcHdr/>
-        <w:dataBinding w:prefixMappings="xmlns:ns0='urn:microsoft-dynamics-nav/reports/AccusationReminder/50144/'" w:xpath="/ns0:NavWordReportXmlPart[1]/ns0:DataItem1[1]/ns0:Picture[1]" w:storeItemID="{457B99F0-4FFA-4FEF-85B8-B5950BE70A3C}"/>
+        <w:dataBinding w:prefixMappings="xmlns:ns0='urn:microsoft-dynamics-nav/reports/IssuedAccusationReminder/50155/'" w:xpath="/ns0:NavWordReportXmlPart[1]/ns0:DataItem1[1]/ns0:Picture[1]" w:storeItemID="{457B99F0-4FFA-4FEF-85B8-B5950BE70A3C}"/>
         <w:picture/>
         <w:alias w:val="#Nav: /DataItem1/Picture"/>
-        <w:tag w:val="#Nav: AccusationReminder/50144"/>
+        <w:tag w:val="#Nav: IssuedAccusationReminder/50155"/>
       </w:sdtPr>
       <w:sdtContent>
         <w:r>
@@ -3936,7 +3936,7 @@
 
 <file path=customXml/item3.xml>��< ? x m l   v e r s i o n = " 1 . 0 "   e n c o d i n g = " u t f - 1 6 " ? >   
- < N a v W o r d R e p o r t X m l P a r t   x m l n s = " u r n : m i c r o s o f t - d y n a m i c s - n a v / r e p o r t s / A c c u s a t i o n R e m i n d e r / 5 0 1 4 4 / " > + < N a v W o r d R e p o r t X m l P a r t   x m l n s = " u r n : m i c r o s o f t - d y n a m i c s - n a v / r e p o r t s / I s s u e d A c c u s a t i o n R e m i n d e r / 5 0 1 5 5 / " >   
      < D a t a I t e m 1 >   
@@ -3944,14 +3944,8 @@
  
          < a c t i v i t y C o d e > a c t i v i t y C o d e < / a c t i v i t y C o d e >   
-         < C a l c u l a t i o n _ D a t e _ F r o m > C a l c u l a t i o n _ D a t e _ F r o m < / C a l c u l a t i o n _ D a t e _ F r o m > - 
-         < C a l c u l a t i o n _ D a t e _ T o > C a l c u l a t i o n _ D a t e _ T o < / C a l c u l a t i o n _ D a t e _ T o > - 
          < C E O _ P h o n e > C E O _ P h o n e < / C E O _ P h o n e >   
-         < C i t y _ M M > C i t y _ M M < / C i t y _ M M > - 
          < C o m p I n f o A d d r e s s > C o m p I n f o A d d r e s s < / C o m p I n f o A d d r e s s >   
          < C o m p I n f o C i t y > C o m p I n f o C i t y < / C o m p I n f o C i t y > @@ -3964,18 +3958,6 @@
  
          < C o m p P a g e > C o m p P a g e < / C o m p P a g e >   
-         < c o m p _ d j e l a t n o s t > c o m p _ d j e l a t n o s t < / c o m p _ d j e l a t n o s t > - 
-         < c o m p _ M B S > c o m p _ M B S < / c o m p _ M B S > - 
-         < c o m p _ r e g > c o m p _ r e g < / c o m p _ r e g > - 
-         < c o m p _ r e g t e x t > c o m p _ r e g t e x t < / c o m p _ r e g t e x t > - 
-         < c o m p _ t a x > c o m p _ t a x < / c o m p _ t a x > - 
-         < c o m p _ v a t > c o m p _ v a t < / c o m p _ v a t > - 
          < c o u r t > c o u r t < / c o u r t >   
          < c o u r t N u m b e r > c o u r t N u m b e r < / c o u r t N u m b e r > @@ -3986,8 +3968,6 @@
  
          < C u s t o m e r N a m e > C u s t o m e r N a m e < / C u s t o m e r N a m e >   
-         < C u s t o m e r _ N o _ > C u s t o m e r _ N o _ < / C u s t o m e r _ N o _ > - 
          < D e a d l i n e D a t e > D e a d l i n e D a t e < / D e a d l i n e D a t e >   
          < D e b t > D e b t < / D e b t > @@ -3998,14 +3978,10 @@
  
          < D o c u m e n t _ D a t e > D o c u m e n t _ D a t e < / D o c u m e n t _ D a t e >   
-         < D u e O r g > D u e O r g < / D u e O r g > - 
          < F a x N o > F a x N o < / F a x N o >   
          < I n v o i c e N o s > I n v o i c e N o s < / I n v o i c e N o s >   
-         < M j e s e c > M j e s e c < / M j e s e c > - 
          < N o > N o < / N o >   
          < P a g e N o C a p t i o n > P a g e N o C a p t i o n < / P a g e N o C a p t i o n > @@ -4016,8 +3992,6 @@
  
          < P i c t u r e   / >   
-         < P o s t _ C o d e _ M M > P o s t _ C o d e _ M M < / P o s t _ C o d e _ M M > - 
          < r e g i s t r a t i o n N u m b e r > r e g i s t r a t i o n N u m b e r < / r e g i s t r a t i o n N u m b e r >   
          < r e g i s t r a t i o n V A T N u m b e r > r e g i s t r a t i o n V A T N u m b e r < / r e g i s t r a t i o n V A T N u m b e r > @@ -4040,21 +4014,9 @@
  
          < D a t a I t e m 2 >   
-             < B r o j a c > B r o j a c < / B r o j a c > - 
-             < D o c u m e n t _ N o _ > D o c u m e n t _ N o _ < / D o c u m e n t _ N o _ > - 
-             < D u e _ D a t e > D u e _ D a t e < / D u e _ D a t e > - 
              < I n v o i c e D e s c r i p t i o n > I n v o i c e D e s c r i p t i o n < / I n v o i c e D e s c r i p t i o n >   
              < l i n e C o u n t e r > l i n e C o u n t e r < / l i n e C o u n t e r > - 
-             < O r g i n a l D a t e > O r g i n a l D a t e < / O r g i n a l D a t e > - 
-             < O r i g i n a l _ A m o u n t > O r i g i n a l _ A m o u n t < / O r i g i n a l _ A m o u n t > - 
-             < R e m a i n i n g _ A m o u n t > R e m a i n i n g _ A m o u n t < / R e m a i n i n g _ A m o u n t >   
          < / D a t a I t e m 2 >   

</xml_diff>